<commit_message>
DGCAST: épreuves et fiches de révision refaites d'après les leçons réellement faites (F1–F4)
Co-Authored-By: Claude Sonnet 5.5 <noreply@anthropic.com>
Claude-Session: https://claude.ai/code/session_0115LFSb2ktGLWPeVksFkSer
</commit_message>
<xml_diff>
--- a/epreuves/2026-2027/DGCAST_Sequence_1/DGCAST_F1_Geography_Seq1_2026-2027.docx
+++ b/epreuves/2026-2027/DGCAST_Sequence_1/DGCAST_F1_Geography_Seq1_2026-2027.docx
@@ -262,7 +262,7 @@
                 <wp:inline distT="0" distB="0" distL="0" distR="0">
                   <wp:extent cx="1428750" cy="1104900"/>
                   <wp:effectExtent t="0" r="0" b="0" l="0"/>
-                  <wp:docPr id="5" name="" descr="" title=""/>
+                  <wp:docPr id="6" name="" descr="" title=""/>
                   <wp:cNvGraphicFramePr>
                     <a:graphicFrameLocks xmlns:a="http://schemas.openxmlformats.org/drawingml/2006/main" noChangeAspect="1"/>
                   </wp:cNvGraphicFramePr>
@@ -1594,7 +1594,7 @@
                 <w:sz w:val="22"/>
                 <w:szCs w:val="22"/>
               </w:rPr>
-              <w:t xml:space="preserve">6. Water covers about … of the Earth’s surface.</w:t>
+              <w:t xml:space="preserve">6. The part of a map that explains the signs and colours used on it is the:</w:t>
             </w:r>
           </w:p>
           <w:p>
@@ -1608,7 +1608,7 @@
                 <w:sz w:val="22"/>
                 <w:szCs w:val="22"/>
               </w:rPr>
-              <w:t xml:space="preserve">A.  29 %</w:t>
+              <w:t xml:space="preserve">A.  Title</w:t>
             </w:r>
           </w:p>
           <w:p>
@@ -1622,7 +1622,7 @@
                 <w:sz w:val="22"/>
                 <w:szCs w:val="22"/>
               </w:rPr>
-              <w:t xml:space="preserve">B.  50 %</w:t>
+              <w:t xml:space="preserve">B.  Scale</w:t>
             </w:r>
           </w:p>
           <w:p>
@@ -1636,7 +1636,7 @@
                 <w:sz w:val="22"/>
                 <w:szCs w:val="22"/>
               </w:rPr>
-              <w:t xml:space="preserve">C.  71 %</w:t>
+              <w:t xml:space="preserve">C.  Key (legend)</w:t>
             </w:r>
           </w:p>
           <w:p>
@@ -1650,7 +1650,7 @@
                 <w:sz w:val="22"/>
                 <w:szCs w:val="22"/>
               </w:rPr>
-              <w:t xml:space="preserve">D.  90 %</w:t>
+              <w:t xml:space="preserve">D.  North arrow</w:t>
             </w:r>
           </w:p>
         </w:tc>
@@ -1688,7 +1688,7 @@
                 <w:sz w:val="22"/>
                 <w:szCs w:val="22"/>
               </w:rPr>
-              <w:t xml:space="preserve">2. The branch of geography that studies relief, climate, rivers and soils is:</w:t>
+              <w:t xml:space="preserve">2. Population geography and settlement geography belong to:</w:t>
             </w:r>
           </w:p>
           <w:p>
@@ -1702,7 +1702,7 @@
                 <w:sz w:val="22"/>
                 <w:szCs w:val="22"/>
               </w:rPr>
-              <w:t xml:space="preserve">A.  Human geography</w:t>
+              <w:t xml:space="preserve">A.  Physical geography</w:t>
             </w:r>
           </w:p>
           <w:p>
@@ -1716,7 +1716,7 @@
                 <w:sz w:val="22"/>
                 <w:szCs w:val="22"/>
               </w:rPr>
-              <w:t xml:space="preserve">B.  Practical geography</w:t>
+              <w:t xml:space="preserve">B.  Human geography</w:t>
             </w:r>
           </w:p>
           <w:p>
@@ -1730,7 +1730,7 @@
                 <w:sz w:val="22"/>
                 <w:szCs w:val="22"/>
               </w:rPr>
-              <w:t xml:space="preserve">C.  Physical geography</w:t>
+              <w:t xml:space="preserve">C.  Practical geography</w:t>
             </w:r>
           </w:p>
           <w:p>
@@ -1744,7 +1744,7 @@
                 <w:sz w:val="22"/>
                 <w:szCs w:val="22"/>
               </w:rPr>
-              <w:t xml:space="preserve">D.  Economic geography</w:t>
+              <w:t xml:space="preserve">D.  Climatology</w:t>
             </w:r>
           </w:p>
         </w:tc>
@@ -1777,7 +1777,7 @@
                 <w:sz w:val="22"/>
                 <w:szCs w:val="22"/>
               </w:rPr>
-              <w:t xml:space="preserve">7. The largest ocean in the world is the:</w:t>
+              <w:t xml:space="preserve">7. Which of the following is the correct way of writing the coordinates of Garoua?</w:t>
             </w:r>
           </w:p>
           <w:p>
@@ -1791,7 +1791,7 @@
                 <w:sz w:val="22"/>
                 <w:szCs w:val="22"/>
               </w:rPr>
-              <w:t xml:space="preserve">A.  Atlantic Ocean</w:t>
+              <w:t xml:space="preserve">A.  9° N, 13° E</w:t>
             </w:r>
           </w:p>
           <w:p>
@@ -1805,7 +1805,7 @@
                 <w:sz w:val="22"/>
                 <w:szCs w:val="22"/>
               </w:rPr>
-              <w:t xml:space="preserve">B.  Indian Ocean</w:t>
+              <w:t xml:space="preserve">B.  13° E, 9° N</w:t>
             </w:r>
           </w:p>
           <w:p>
@@ -1819,7 +1819,7 @@
                 <w:sz w:val="22"/>
                 <w:szCs w:val="22"/>
               </w:rPr>
-              <w:t xml:space="preserve">C.  Pacific Ocean</w:t>
+              <w:t xml:space="preserve">C.  9° E, 13° N</w:t>
             </w:r>
           </w:p>
           <w:p>
@@ -1833,7 +1833,7 @@
                 <w:sz w:val="22"/>
                 <w:szCs w:val="22"/>
               </w:rPr>
-              <w:t xml:space="preserve">D.  Arctic Ocean</w:t>
+              <w:t xml:space="preserve">D.  13° N, 9° E</w:t>
             </w:r>
           </w:p>
         </w:tc>
@@ -1871,7 +1871,7 @@
                 <w:sz w:val="22"/>
                 <w:szCs w:val="22"/>
               </w:rPr>
-              <w:t xml:space="preserve">3. Population geography and settlement geography belong to:</w:t>
+              <w:t xml:space="preserve">3. From the Sun, the Earth is the:</w:t>
             </w:r>
           </w:p>
           <w:p>
@@ -1885,7 +1885,7 @@
                 <w:sz w:val="22"/>
                 <w:szCs w:val="22"/>
               </w:rPr>
-              <w:t xml:space="preserve">A.  Physical geography</w:t>
+              <w:t xml:space="preserve">A.  First planet</w:t>
             </w:r>
           </w:p>
           <w:p>
@@ -1899,7 +1899,7 @@
                 <w:sz w:val="22"/>
                 <w:szCs w:val="22"/>
               </w:rPr>
-              <w:t xml:space="preserve">B.  Human geography</w:t>
+              <w:t xml:space="preserve">B.  Second planet</w:t>
             </w:r>
           </w:p>
           <w:p>
@@ -1913,7 +1913,7 @@
                 <w:sz w:val="22"/>
                 <w:szCs w:val="22"/>
               </w:rPr>
-              <w:t xml:space="preserve">C.  Practical geography</w:t>
+              <w:t xml:space="preserve">C.  Third planet</w:t>
             </w:r>
           </w:p>
           <w:p>
@@ -1927,7 +1927,7 @@
                 <w:sz w:val="22"/>
                 <w:szCs w:val="22"/>
               </w:rPr>
-              <w:t xml:space="preserve">D.  Climatology</w:t>
+              <w:t xml:space="preserve">D.  Fourth planet</w:t>
             </w:r>
           </w:p>
         </w:tc>
@@ -1960,7 +1960,7 @@
                 <w:sz w:val="22"/>
                 <w:szCs w:val="22"/>
               </w:rPr>
-              <w:t xml:space="preserve">8. A round model of the Earth is called a:</w:t>
+              <w:t xml:space="preserve">8. The latitude and the longitude of a place are called its:</w:t>
             </w:r>
           </w:p>
           <w:p>
@@ -1974,7 +1974,7 @@
                 <w:sz w:val="22"/>
                 <w:szCs w:val="22"/>
               </w:rPr>
-              <w:t xml:space="preserve">A.  Map</w:t>
+              <w:t xml:space="preserve">A.  Cardinal points</w:t>
             </w:r>
           </w:p>
           <w:p>
@@ -1988,7 +1988,7 @@
                 <w:sz w:val="22"/>
                 <w:szCs w:val="22"/>
               </w:rPr>
-              <w:t xml:space="preserve">B.  Globe</w:t>
+              <w:t xml:space="preserve">B.  Geographical coordinates</w:t>
             </w:r>
           </w:p>
           <w:p>
@@ -2002,7 +2002,7 @@
                 <w:sz w:val="22"/>
                 <w:szCs w:val="22"/>
               </w:rPr>
-              <w:t xml:space="preserve">C.  Projection</w:t>
+              <w:t xml:space="preserve">C.  Scale</w:t>
             </w:r>
           </w:p>
           <w:p>
@@ -2016,7 +2016,7 @@
                 <w:sz w:val="22"/>
                 <w:szCs w:val="22"/>
               </w:rPr>
-              <w:t xml:space="preserve">D.  Atlas</w:t>
+              <w:t xml:space="preserve">D.  Key</w:t>
             </w:r>
           </w:p>
         </w:tc>
@@ -2054,7 +2054,7 @@
                 <w:sz w:val="22"/>
                 <w:szCs w:val="22"/>
               </w:rPr>
-              <w:t xml:space="preserve">4. Which method do geographers use to collect information directly from people?</w:t>
+              <w:t xml:space="preserve">4. Water covers about … of the Earth’s surface.</w:t>
             </w:r>
           </w:p>
           <w:p>
@@ -2068,7 +2068,7 @@
                 <w:sz w:val="22"/>
                 <w:szCs w:val="22"/>
               </w:rPr>
-              <w:t xml:space="preserve">A.  Questionnaires and interviews</w:t>
+              <w:t xml:space="preserve">A.  29 %</w:t>
             </w:r>
           </w:p>
           <w:p>
@@ -2082,7 +2082,7 @@
                 <w:sz w:val="22"/>
                 <w:szCs w:val="22"/>
               </w:rPr>
-              <w:t xml:space="preserve">B.  Satellite images</w:t>
+              <w:t xml:space="preserve">B.  50 %</w:t>
             </w:r>
           </w:p>
           <w:p>
@@ -2096,7 +2096,7 @@
                 <w:sz w:val="22"/>
                 <w:szCs w:val="22"/>
               </w:rPr>
-              <w:t xml:space="preserve">C.  Map projections</w:t>
+              <w:t xml:space="preserve">C.  71 %</w:t>
             </w:r>
           </w:p>
           <w:p>
@@ -2110,7 +2110,7 @@
                 <w:sz w:val="22"/>
                 <w:szCs w:val="22"/>
               </w:rPr>
-              <w:t xml:space="preserve">D.  Contour lines</w:t>
+              <w:t xml:space="preserve">D.  90 %</w:t>
             </w:r>
           </w:p>
         </w:tc>
@@ -2143,7 +2143,7 @@
                 <w:sz w:val="22"/>
                 <w:szCs w:val="22"/>
               </w:rPr>
-              <w:t xml:space="preserve">9. The part of a map that explains the signs and colours used on it is the:</w:t>
+              <w:t xml:space="preserve">9. The turning of the Earth on its axis from west to east in 24 hours is called:</w:t>
             </w:r>
           </w:p>
           <w:p>
@@ -2157,7 +2157,7 @@
                 <w:sz w:val="22"/>
                 <w:szCs w:val="22"/>
               </w:rPr>
-              <w:t xml:space="preserve">A.  Title</w:t>
+              <w:t xml:space="preserve">A.  Revolution</w:t>
             </w:r>
           </w:p>
           <w:p>
@@ -2171,7 +2171,7 @@
                 <w:sz w:val="22"/>
                 <w:szCs w:val="22"/>
               </w:rPr>
-              <w:t xml:space="preserve">B.  Scale</w:t>
+              <w:t xml:space="preserve">B.  Rotation</w:t>
             </w:r>
           </w:p>
           <w:p>
@@ -2185,7 +2185,7 @@
                 <w:sz w:val="22"/>
                 <w:szCs w:val="22"/>
               </w:rPr>
-              <w:t xml:space="preserve">C.  Key (legend)</w:t>
+              <w:t xml:space="preserve">C.  An orbit</w:t>
             </w:r>
           </w:p>
           <w:p>
@@ -2199,7 +2199,7 @@
                 <w:sz w:val="22"/>
                 <w:szCs w:val="22"/>
               </w:rPr>
-              <w:t xml:space="preserve">D.  North arrow</w:t>
+              <w:t xml:space="preserve">D.  A season</w:t>
             </w:r>
           </w:p>
         </w:tc>
@@ -2237,7 +2237,7 @@
                 <w:sz w:val="22"/>
                 <w:szCs w:val="22"/>
               </w:rPr>
-              <w:t xml:space="preserve">5. From the Sun, the Earth is the:</w:t>
+              <w:t xml:space="preserve">5. A round model of the Earth is called a:</w:t>
             </w:r>
           </w:p>
           <w:p>
@@ -2251,7 +2251,7 @@
                 <w:sz w:val="22"/>
                 <w:szCs w:val="22"/>
               </w:rPr>
-              <w:t xml:space="preserve">A.  First planet</w:t>
+              <w:t xml:space="preserve">A.  Map</w:t>
             </w:r>
           </w:p>
           <w:p>
@@ -2265,7 +2265,7 @@
                 <w:sz w:val="22"/>
                 <w:szCs w:val="22"/>
               </w:rPr>
-              <w:t xml:space="preserve">B.  Second planet</w:t>
+              <w:t xml:space="preserve">B.  Globe</w:t>
             </w:r>
           </w:p>
           <w:p>
@@ -2279,7 +2279,7 @@
                 <w:sz w:val="22"/>
                 <w:szCs w:val="22"/>
               </w:rPr>
-              <w:t xml:space="preserve">C.  Third planet</w:t>
+              <w:t xml:space="preserve">C.  Projection</w:t>
             </w:r>
           </w:p>
           <w:p>
@@ -2293,7 +2293,7 @@
                 <w:sz w:val="22"/>
                 <w:szCs w:val="22"/>
               </w:rPr>
-              <w:t xml:space="preserve">D.  Fourth planet</w:t>
+              <w:t xml:space="preserve">D.  Atlas</w:t>
             </w:r>
           </w:p>
         </w:tc>
@@ -2326,7 +2326,7 @@
                 <w:sz w:val="22"/>
                 <w:szCs w:val="22"/>
               </w:rPr>
-              <w:t xml:space="preserve">10. The latitude and the longitude of a place are called its:</w:t>
+              <w:t xml:space="preserve">10. The Earth takes about … to go round the Sun.</w:t>
             </w:r>
           </w:p>
           <w:p>
@@ -2340,7 +2340,7 @@
                 <w:sz w:val="22"/>
                 <w:szCs w:val="22"/>
               </w:rPr>
-              <w:t xml:space="preserve">A.  Cardinal points</w:t>
+              <w:t xml:space="preserve">A.  24 hours</w:t>
             </w:r>
           </w:p>
           <w:p>
@@ -2354,7 +2354,7 @@
                 <w:sz w:val="22"/>
                 <w:szCs w:val="22"/>
               </w:rPr>
-              <w:t xml:space="preserve">B.  Geographical coordinates</w:t>
+              <w:t xml:space="preserve">B.  30 days</w:t>
             </w:r>
           </w:p>
           <w:p>
@@ -2368,7 +2368,7 @@
                 <w:sz w:val="22"/>
                 <w:szCs w:val="22"/>
               </w:rPr>
-              <w:t xml:space="preserve">C.  Scale</w:t>
+              <w:t xml:space="preserve">C.  365¼ days</w:t>
             </w:r>
           </w:p>
           <w:p>
@@ -2382,7 +2382,7 @@
                 <w:sz w:val="22"/>
                 <w:szCs w:val="22"/>
               </w:rPr>
-              <w:t xml:space="preserve">D.  Key</w:t>
+              <w:t xml:space="preserve">D.  10 years</w:t>
             </w:r>
           </w:p>
         </w:tc>

</xml_diff>